<commit_message>
Updated the documents with notebook link
</commit_message>
<xml_diff>
--- a/used_car_price_predictor/UsedCar_Price_Predictor.docx
+++ b/used_car_price_predictor/UsedCar_Price_Predictor.docx
@@ -52,6 +52,1216 @@
       <w:pPr>
         <w:rPr>
           <w:rFonts w:cstheme="minorHAnsi"/>
+          <w:b/>
+          <w:bCs/>
+          <w:color w:val="000000"/>
+          <w:sz w:val="36"/>
+          <w:szCs w:val="36"/>
+          <w:shd w:val="clear" w:color="auto" w:fill="FFFFFF"/>
+        </w:rPr>
+      </w:pPr>
+      <w:r>
+        <w:rPr>
+          <w:rFonts w:cstheme="minorHAnsi"/>
+          <w:b/>
+          <w:bCs/>
+          <w:color w:val="000000"/>
+          <w:sz w:val="36"/>
+          <w:szCs w:val="36"/>
+          <w:shd w:val="clear" w:color="auto" w:fill="FFFFFF"/>
+        </w:rPr>
+        <w:t>As per our objective of identifying the key drivers that influence used car prices.</w:t>
+      </w:r>
+    </w:p>
+    <w:p>
+      <w:pPr>
+        <w:rPr>
+          <w:rFonts w:cstheme="minorHAnsi"/>
+          <w:color w:val="000000"/>
+          <w:sz w:val="36"/>
+          <w:szCs w:val="36"/>
+          <w:shd w:val="clear" w:color="auto" w:fill="FFFFFF"/>
+        </w:rPr>
+      </w:pPr>
+      <w:r>
+        <w:rPr>
+          <w:rFonts w:cstheme="minorHAnsi"/>
+          <w:color w:val="000000"/>
+          <w:sz w:val="36"/>
+          <w:szCs w:val="36"/>
+          <w:shd w:val="clear" w:color="auto" w:fill="FFFFFF"/>
+        </w:rPr>
+        <w:t>We need to understand how each of the factors will help provide insights for setting competitive prices and optimizing inventory management</w:t>
+      </w:r>
+    </w:p>
+    <w:p>
+      <w:pPr>
+        <w:rPr>
+          <w:rFonts w:cstheme="minorHAnsi"/>
+          <w:color w:val="000000"/>
+          <w:sz w:val="36"/>
+          <w:szCs w:val="36"/>
+          <w:shd w:val="clear" w:color="auto" w:fill="FFFFFF"/>
+        </w:rPr>
+      </w:pPr>
+      <w:r>
+        <w:rPr>
+          <w:rFonts w:cstheme="minorHAnsi"/>
+          <w:color w:val="000000"/>
+          <w:sz w:val="36"/>
+          <w:szCs w:val="36"/>
+          <w:shd w:val="clear" w:color="auto" w:fill="FFFFFF"/>
+        </w:rPr>
+        <w:t>We used 3 models here 1. Linear Regression 2. Ridge Regression 3. Lasso Regression Below are the Metrics Evaluation for each of them:</w:t>
+      </w:r>
+    </w:p>
+    <w:p>
+      <w:pPr>
+        <w:rPr>
+          <w:rFonts w:cstheme="minorHAnsi"/>
+          <w:b/>
+          <w:bCs/>
+          <w:color w:val="000000"/>
+          <w:sz w:val="36"/>
+          <w:szCs w:val="36"/>
+          <w:shd w:val="clear" w:color="auto" w:fill="FFFFFF"/>
+        </w:rPr>
+      </w:pPr>
+      <w:r>
+        <w:rPr>
+          <w:rFonts w:cstheme="minorHAnsi"/>
+          <w:b/>
+          <w:bCs/>
+          <w:color w:val="000000"/>
+          <w:sz w:val="36"/>
+          <w:szCs w:val="36"/>
+          <w:shd w:val="clear" w:color="auto" w:fill="FFFFFF"/>
+        </w:rPr>
+        <w:t>Linear Regression:</w:t>
+      </w:r>
+    </w:p>
+    <w:p>
+      <w:pPr>
+        <w:rPr>
+          <w:rFonts w:cstheme="minorHAnsi"/>
+          <w:color w:val="000000"/>
+          <w:sz w:val="36"/>
+          <w:szCs w:val="36"/>
+          <w:shd w:val="clear" w:color="auto" w:fill="FFFFFF"/>
+        </w:rPr>
+      </w:pPr>
+      <w:r>
+        <w:rPr>
+          <w:rFonts w:cstheme="minorHAnsi"/>
+          <w:color w:val="000000"/>
+          <w:sz w:val="36"/>
+          <w:szCs w:val="36"/>
+          <w:shd w:val="clear" w:color="auto" w:fill="FFFFFF"/>
+        </w:rPr>
+        <w:t>RMSE: 96,617,279</w:t>
+      </w:r>
+    </w:p>
+    <w:p>
+      <w:pPr>
+        <w:rPr>
+          <w:rFonts w:cstheme="minorHAnsi"/>
+          <w:color w:val="000000"/>
+          <w:sz w:val="36"/>
+          <w:szCs w:val="36"/>
+          <w:shd w:val="clear" w:color="auto" w:fill="FFFFFF"/>
+        </w:rPr>
+      </w:pPr>
+      <w:r>
+        <w:rPr>
+          <w:rFonts w:cstheme="minorHAnsi"/>
+          <w:color w:val="000000"/>
+          <w:sz w:val="36"/>
+          <w:szCs w:val="36"/>
+          <w:shd w:val="clear" w:color="auto" w:fill="FFFFFF"/>
+        </w:rPr>
+        <w:t>R²: 0.462</w:t>
+      </w:r>
+    </w:p>
+    <w:p>
+      <w:pPr>
+        <w:rPr>
+          <w:rFonts w:cstheme="minorHAnsi"/>
+          <w:color w:val="000000"/>
+          <w:sz w:val="36"/>
+          <w:szCs w:val="36"/>
+          <w:shd w:val="clear" w:color="auto" w:fill="FFFFFF"/>
+        </w:rPr>
+      </w:pPr>
+      <w:r>
+        <w:rPr>
+          <w:rFonts w:cstheme="minorHAnsi"/>
+          <w:color w:val="000000"/>
+          <w:sz w:val="36"/>
+          <w:szCs w:val="36"/>
+          <w:shd w:val="clear" w:color="auto" w:fill="FFFFFF"/>
+        </w:rPr>
+        <w:t>MAE: 7,041</w:t>
+      </w:r>
+    </w:p>
+    <w:p>
+      <w:pPr>
+        <w:rPr>
+          <w:rFonts w:cstheme="minorHAnsi"/>
+          <w:color w:val="000000"/>
+          <w:sz w:val="36"/>
+          <w:szCs w:val="36"/>
+          <w:shd w:val="clear" w:color="auto" w:fill="FFFFFF"/>
+        </w:rPr>
+      </w:pPr>
+      <w:r>
+        <w:rPr>
+          <w:rFonts w:cstheme="minorHAnsi"/>
+          <w:color w:val="000000"/>
+          <w:sz w:val="36"/>
+          <w:szCs w:val="36"/>
+          <w:shd w:val="clear" w:color="auto" w:fill="FFFFFF"/>
+        </w:rPr>
+        <w:t>The above metrics shows that moderate prediction accuracy. The scatter plot indicates error in predictions of prices as the points are not closely aligned with the diagonal line of linear regression.</w:t>
+      </w:r>
+    </w:p>
+    <w:p>
+      <w:pPr>
+        <w:rPr>
+          <w:rFonts w:cstheme="minorHAnsi"/>
+          <w:b/>
+          <w:bCs/>
+          <w:color w:val="000000"/>
+          <w:sz w:val="36"/>
+          <w:szCs w:val="36"/>
+          <w:shd w:val="clear" w:color="auto" w:fill="FFFFFF"/>
+        </w:rPr>
+      </w:pPr>
+      <w:r>
+        <w:rPr>
+          <w:rFonts w:cstheme="minorHAnsi"/>
+          <w:b/>
+          <w:bCs/>
+          <w:color w:val="000000"/>
+          <w:sz w:val="36"/>
+          <w:szCs w:val="36"/>
+          <w:shd w:val="clear" w:color="auto" w:fill="FFFFFF"/>
+        </w:rPr>
+        <w:t>Ridge Regression:</w:t>
+      </w:r>
+    </w:p>
+    <w:p>
+      <w:pPr>
+        <w:rPr>
+          <w:rFonts w:cstheme="minorHAnsi"/>
+          <w:color w:val="000000"/>
+          <w:sz w:val="36"/>
+          <w:szCs w:val="36"/>
+          <w:shd w:val="clear" w:color="auto" w:fill="FFFFFF"/>
+        </w:rPr>
+      </w:pPr>
+      <w:r>
+        <w:rPr>
+          <w:rFonts w:cstheme="minorHAnsi"/>
+          <w:color w:val="000000"/>
+          <w:sz w:val="36"/>
+          <w:szCs w:val="36"/>
+          <w:shd w:val="clear" w:color="auto" w:fill="FFFFFF"/>
+        </w:rPr>
+        <w:t>RMSE: 96,253,632</w:t>
+      </w:r>
+    </w:p>
+    <w:p>
+      <w:pPr>
+        <w:rPr>
+          <w:rFonts w:cstheme="minorHAnsi"/>
+          <w:color w:val="000000"/>
+          <w:sz w:val="36"/>
+          <w:szCs w:val="36"/>
+          <w:shd w:val="clear" w:color="auto" w:fill="FFFFFF"/>
+        </w:rPr>
+      </w:pPr>
+      <w:r>
+        <w:rPr>
+          <w:rFonts w:cstheme="minorHAnsi"/>
+          <w:color w:val="000000"/>
+          <w:sz w:val="36"/>
+          <w:szCs w:val="36"/>
+          <w:shd w:val="clear" w:color="auto" w:fill="FFFFFF"/>
+        </w:rPr>
+        <w:t>R²: 0.463</w:t>
+      </w:r>
+    </w:p>
+    <w:p>
+      <w:pPr>
+        <w:rPr>
+          <w:rFonts w:cstheme="minorHAnsi"/>
+          <w:color w:val="000000"/>
+          <w:sz w:val="36"/>
+          <w:szCs w:val="36"/>
+          <w:shd w:val="clear" w:color="auto" w:fill="FFFFFF"/>
+        </w:rPr>
+      </w:pPr>
+      <w:r>
+        <w:rPr>
+          <w:rFonts w:cstheme="minorHAnsi"/>
+          <w:color w:val="000000"/>
+          <w:sz w:val="36"/>
+          <w:szCs w:val="36"/>
+          <w:shd w:val="clear" w:color="auto" w:fill="FFFFFF"/>
+        </w:rPr>
+        <w:t>MAE: 7,036</w:t>
+      </w:r>
+    </w:p>
+    <w:p>
+      <w:pPr>
+        <w:rPr>
+          <w:rFonts w:cstheme="minorHAnsi"/>
+          <w:color w:val="000000"/>
+          <w:sz w:val="36"/>
+          <w:szCs w:val="36"/>
+          <w:shd w:val="clear" w:color="auto" w:fill="FFFFFF"/>
+        </w:rPr>
+      </w:pPr>
+      <w:r>
+        <w:rPr>
+          <w:rFonts w:cstheme="minorHAnsi"/>
+          <w:color w:val="000000"/>
+          <w:sz w:val="36"/>
+          <w:szCs w:val="36"/>
+          <w:shd w:val="clear" w:color="auto" w:fill="FFFFFF"/>
+        </w:rPr>
+        <w:t xml:space="preserve">Similar to Linear Regression, even with regularization not significantly improving the model performance. </w:t>
+      </w:r>
+      <w:r>
+        <w:rPr>
+          <w:rFonts w:cstheme="minorHAnsi"/>
+          <w:color w:val="000000"/>
+          <w:sz w:val="36"/>
+          <w:szCs w:val="36"/>
+          <w:shd w:val="clear" w:color="auto" w:fill="FFFFFF"/>
+        </w:rPr>
+        <w:t>However,</w:t>
+      </w:r>
+      <w:r>
+        <w:rPr>
+          <w:rFonts w:cstheme="minorHAnsi"/>
+          <w:color w:val="000000"/>
+          <w:sz w:val="36"/>
+          <w:szCs w:val="36"/>
+          <w:shd w:val="clear" w:color="auto" w:fill="FFFFFF"/>
+        </w:rPr>
+        <w:t xml:space="preserve"> the results are consistent for RMSE even with different alpha values. Seems regularization had not given any uplift in model performance. The residual histogram also confirms variability in </w:t>
+      </w:r>
+      <w:r>
+        <w:rPr>
+          <w:rFonts w:cstheme="minorHAnsi"/>
+          <w:color w:val="000000"/>
+          <w:sz w:val="36"/>
+          <w:szCs w:val="36"/>
+          <w:shd w:val="clear" w:color="auto" w:fill="FFFFFF"/>
+        </w:rPr>
+        <w:lastRenderedPageBreak/>
+        <w:t>predictions errors. Tails of graphs show higher prediction errors and maybe it is struggling with available data</w:t>
+      </w:r>
+    </w:p>
+    <w:p>
+      <w:pPr>
+        <w:rPr>
+          <w:rFonts w:cstheme="minorHAnsi"/>
+          <w:b/>
+          <w:bCs/>
+          <w:color w:val="000000"/>
+          <w:sz w:val="36"/>
+          <w:szCs w:val="36"/>
+          <w:shd w:val="clear" w:color="auto" w:fill="FFFFFF"/>
+        </w:rPr>
+      </w:pPr>
+      <w:r>
+        <w:rPr>
+          <w:rFonts w:cstheme="minorHAnsi"/>
+          <w:b/>
+          <w:bCs/>
+          <w:color w:val="000000"/>
+          <w:sz w:val="36"/>
+          <w:szCs w:val="36"/>
+          <w:shd w:val="clear" w:color="auto" w:fill="FFFFFF"/>
+        </w:rPr>
+        <w:t>Lasso Regression:</w:t>
+      </w:r>
+    </w:p>
+    <w:p>
+      <w:pPr>
+        <w:rPr>
+          <w:rFonts w:cstheme="minorHAnsi"/>
+          <w:color w:val="000000"/>
+          <w:sz w:val="36"/>
+          <w:szCs w:val="36"/>
+          <w:shd w:val="clear" w:color="auto" w:fill="FFFFFF"/>
+        </w:rPr>
+      </w:pPr>
+      <w:r>
+        <w:rPr>
+          <w:rFonts w:cstheme="minorHAnsi"/>
+          <w:color w:val="000000"/>
+          <w:sz w:val="36"/>
+          <w:szCs w:val="36"/>
+          <w:shd w:val="clear" w:color="auto" w:fill="FFFFFF"/>
+        </w:rPr>
+        <w:t>RMSE: 9,811 (Best performance)</w:t>
+      </w:r>
+    </w:p>
+    <w:p>
+      <w:pPr>
+        <w:rPr>
+          <w:rFonts w:cstheme="minorHAnsi"/>
+          <w:color w:val="000000"/>
+          <w:sz w:val="36"/>
+          <w:szCs w:val="36"/>
+          <w:shd w:val="clear" w:color="auto" w:fill="FFFFFF"/>
+        </w:rPr>
+      </w:pPr>
+      <w:r>
+        <w:rPr>
+          <w:rFonts w:cstheme="minorHAnsi"/>
+          <w:color w:val="000000"/>
+          <w:sz w:val="36"/>
+          <w:szCs w:val="36"/>
+          <w:shd w:val="clear" w:color="auto" w:fill="FFFFFF"/>
+        </w:rPr>
+        <w:t>R²: 0.463</w:t>
+      </w:r>
+    </w:p>
+    <w:p>
+      <w:pPr>
+        <w:rPr>
+          <w:rFonts w:cstheme="minorHAnsi"/>
+          <w:color w:val="000000"/>
+          <w:sz w:val="36"/>
+          <w:szCs w:val="36"/>
+          <w:shd w:val="clear" w:color="auto" w:fill="FFFFFF"/>
+        </w:rPr>
+      </w:pPr>
+      <w:r>
+        <w:rPr>
+          <w:rFonts w:cstheme="minorHAnsi"/>
+          <w:color w:val="000000"/>
+          <w:sz w:val="36"/>
+          <w:szCs w:val="36"/>
+          <w:shd w:val="clear" w:color="auto" w:fill="FFFFFF"/>
+        </w:rPr>
+        <w:t>MAE: 7,010</w:t>
+      </w:r>
+    </w:p>
+    <w:p>
+      <w:pPr>
+        <w:rPr>
+          <w:rFonts w:cstheme="minorHAnsi"/>
+          <w:color w:val="000000"/>
+          <w:sz w:val="36"/>
+          <w:szCs w:val="36"/>
+          <w:shd w:val="clear" w:color="auto" w:fill="FFFFFF"/>
+        </w:rPr>
+      </w:pPr>
+      <w:r>
+        <w:rPr>
+          <w:rFonts w:cstheme="minorHAnsi"/>
+          <w:b/>
+          <w:bCs/>
+          <w:i/>
+          <w:iCs/>
+          <w:color w:val="000000"/>
+          <w:sz w:val="36"/>
+          <w:szCs w:val="36"/>
+          <w:shd w:val="clear" w:color="auto" w:fill="FFFFFF"/>
+        </w:rPr>
+        <w:t>Lasso seems to offers the best prediction accuracy</w:t>
+      </w:r>
+      <w:r>
+        <w:rPr>
+          <w:rFonts w:cstheme="minorHAnsi"/>
+          <w:color w:val="000000"/>
+          <w:sz w:val="36"/>
+          <w:szCs w:val="36"/>
+          <w:shd w:val="clear" w:color="auto" w:fill="FFFFFF"/>
+        </w:rPr>
+        <w:t xml:space="preserve"> with lowest RMSE as compared to Linear and Ridge regression, but the model </w:t>
+      </w:r>
+      <w:r>
+        <w:rPr>
+          <w:rFonts w:cstheme="minorHAnsi"/>
+          <w:color w:val="000000"/>
+          <w:sz w:val="36"/>
+          <w:szCs w:val="36"/>
+          <w:shd w:val="clear" w:color="auto" w:fill="FFFFFF"/>
+        </w:rPr>
+        <w:t>does</w:t>
+      </w:r>
+      <w:r>
+        <w:rPr>
+          <w:rFonts w:cstheme="minorHAnsi"/>
+          <w:color w:val="000000"/>
+          <w:sz w:val="36"/>
+          <w:szCs w:val="36"/>
+          <w:shd w:val="clear" w:color="auto" w:fill="FFFFFF"/>
+        </w:rPr>
+        <w:t xml:space="preserve"> not predict well considering the variance where around 46% of variance in car prices. Both graph </w:t>
+      </w:r>
+      <w:r>
+        <w:rPr>
+          <w:rFonts w:cstheme="minorHAnsi"/>
+          <w:color w:val="000000"/>
+          <w:sz w:val="36"/>
+          <w:szCs w:val="36"/>
+          <w:shd w:val="clear" w:color="auto" w:fill="FFFFFF"/>
+        </w:rPr>
+        <w:t>(scatter</w:t>
+      </w:r>
+      <w:r>
+        <w:rPr>
+          <w:rFonts w:cstheme="minorHAnsi"/>
+          <w:color w:val="000000"/>
+          <w:sz w:val="36"/>
+          <w:szCs w:val="36"/>
+          <w:shd w:val="clear" w:color="auto" w:fill="FFFFFF"/>
+        </w:rPr>
+        <w:t xml:space="preserve"> and </w:t>
+      </w:r>
+      <w:r>
+        <w:rPr>
+          <w:rFonts w:cstheme="minorHAnsi"/>
+          <w:color w:val="000000"/>
+          <w:sz w:val="36"/>
+          <w:szCs w:val="36"/>
+          <w:shd w:val="clear" w:color="auto" w:fill="FFFFFF"/>
+        </w:rPr>
+        <w:t>histogram)</w:t>
+      </w:r>
+      <w:r>
+        <w:rPr>
+          <w:rFonts w:cstheme="minorHAnsi"/>
+          <w:color w:val="000000"/>
+          <w:sz w:val="36"/>
+          <w:szCs w:val="36"/>
+          <w:shd w:val="clear" w:color="auto" w:fill="FFFFFF"/>
+        </w:rPr>
+        <w:t xml:space="preserve"> confirms that model performance is skewed for certain set of data.</w:t>
+      </w:r>
+    </w:p>
+    <w:p>
+      <w:pPr>
+        <w:rPr>
+          <w:rFonts w:cstheme="minorHAnsi"/>
+          <w:color w:val="000000"/>
+          <w:sz w:val="36"/>
+          <w:szCs w:val="36"/>
+          <w:shd w:val="clear" w:color="auto" w:fill="FFFFFF"/>
+        </w:rPr>
+      </w:pPr>
+      <w:r>
+        <w:rPr>
+          <w:rFonts w:cstheme="minorHAnsi"/>
+          <w:b/>
+          <w:bCs/>
+          <w:i/>
+          <w:iCs/>
+          <w:color w:val="000000"/>
+          <w:sz w:val="36"/>
+          <w:szCs w:val="36"/>
+          <w:shd w:val="clear" w:color="auto" w:fill="FFFFFF"/>
+        </w:rPr>
+        <w:t>Business objective</w:t>
+      </w:r>
+      <w:r>
+        <w:rPr>
+          <w:rFonts w:cstheme="minorHAnsi"/>
+          <w:color w:val="000000"/>
+          <w:sz w:val="36"/>
+          <w:szCs w:val="36"/>
+          <w:shd w:val="clear" w:color="auto" w:fill="FFFFFF"/>
+        </w:rPr>
+        <w:t> was to understand the drivers of used car prices and build a model that can predict used car prices effectively.</w:t>
+      </w:r>
+    </w:p>
+    <w:p>
+      <w:pPr>
+        <w:rPr>
+          <w:rFonts w:cstheme="minorHAnsi"/>
+          <w:color w:val="000000"/>
+          <w:sz w:val="36"/>
+          <w:szCs w:val="36"/>
+          <w:shd w:val="clear" w:color="auto" w:fill="FFFFFF"/>
+        </w:rPr>
+      </w:pPr>
+      <w:r>
+        <w:rPr>
+          <w:rFonts w:cstheme="minorHAnsi"/>
+          <w:b/>
+          <w:bCs/>
+          <w:i/>
+          <w:iCs/>
+          <w:color w:val="000000"/>
+          <w:sz w:val="36"/>
+          <w:szCs w:val="36"/>
+          <w:shd w:val="clear" w:color="auto" w:fill="FFFFFF"/>
+        </w:rPr>
+        <w:t>Findings</w:t>
+      </w:r>
+      <w:r>
+        <w:rPr>
+          <w:rFonts w:cstheme="minorHAnsi"/>
+          <w:color w:val="000000"/>
+          <w:sz w:val="36"/>
+          <w:szCs w:val="36"/>
+          <w:shd w:val="clear" w:color="auto" w:fill="FFFFFF"/>
+        </w:rPr>
+        <w:t xml:space="preserve"> We used the above 3 models and based on the data Lasso regression appears to be the most effective in terms of predictive accuracy due to the significantly lower RMSE. </w:t>
+      </w:r>
+      <w:r>
+        <w:rPr>
+          <w:rFonts w:cstheme="minorHAnsi"/>
+          <w:color w:val="000000"/>
+          <w:sz w:val="36"/>
+          <w:szCs w:val="36"/>
+          <w:shd w:val="clear" w:color="auto" w:fill="FFFFFF"/>
+        </w:rPr>
+        <w:t>However,</w:t>
+      </w:r>
+      <w:r>
+        <w:rPr>
+          <w:rFonts w:cstheme="minorHAnsi"/>
+          <w:color w:val="000000"/>
+          <w:sz w:val="36"/>
+          <w:szCs w:val="36"/>
+          <w:shd w:val="clear" w:color="auto" w:fill="FFFFFF"/>
+        </w:rPr>
+        <w:t xml:space="preserve"> the </w:t>
+      </w:r>
+      <w:r>
+        <w:rPr>
+          <w:rFonts w:cstheme="minorHAnsi"/>
+          <w:b/>
+          <w:bCs/>
+          <w:color w:val="000000"/>
+          <w:sz w:val="36"/>
+          <w:szCs w:val="36"/>
+          <w:shd w:val="clear" w:color="auto" w:fill="FFFFFF"/>
+        </w:rPr>
+        <w:t>R2 score</w:t>
+      </w:r>
+      <w:r>
+        <w:rPr>
+          <w:rFonts w:cstheme="minorHAnsi"/>
+          <w:color w:val="000000"/>
+          <w:sz w:val="36"/>
+          <w:szCs w:val="36"/>
+          <w:shd w:val="clear" w:color="auto" w:fill="FFFFFF"/>
+        </w:rPr>
+        <w:t xml:space="preserve"> for each model suggests that model </w:t>
+      </w:r>
+      <w:r>
+        <w:rPr>
+          <w:rFonts w:cstheme="minorHAnsi"/>
+          <w:color w:val="000000"/>
+          <w:sz w:val="36"/>
+          <w:szCs w:val="36"/>
+          <w:shd w:val="clear" w:color="auto" w:fill="FFFFFF"/>
+        </w:rPr>
+        <w:t>is</w:t>
+      </w:r>
+      <w:r>
+        <w:rPr>
+          <w:rFonts w:cstheme="minorHAnsi"/>
+          <w:color w:val="000000"/>
+          <w:sz w:val="36"/>
+          <w:szCs w:val="36"/>
+          <w:shd w:val="clear" w:color="auto" w:fill="FFFFFF"/>
+        </w:rPr>
+        <w:t xml:space="preserve"> not capturing most of the variance in the target variables, approximately </w:t>
+      </w:r>
+      <w:r>
+        <w:rPr>
+          <w:rFonts w:cstheme="minorHAnsi"/>
+          <w:b/>
+          <w:bCs/>
+          <w:color w:val="000000"/>
+          <w:sz w:val="36"/>
+          <w:szCs w:val="36"/>
+          <w:shd w:val="clear" w:color="auto" w:fill="FFFFFF"/>
+        </w:rPr>
+        <w:t>50%</w:t>
+      </w:r>
+      <w:r>
+        <w:rPr>
+          <w:rFonts w:cstheme="minorHAnsi"/>
+          <w:color w:val="000000"/>
+          <w:sz w:val="36"/>
+          <w:szCs w:val="36"/>
+          <w:shd w:val="clear" w:color="auto" w:fill="FFFFFF"/>
+        </w:rPr>
+        <w:t> of predicted values are either </w:t>
+      </w:r>
+      <w:r>
+        <w:rPr>
+          <w:rFonts w:cstheme="minorHAnsi"/>
+          <w:b/>
+          <w:bCs/>
+          <w:color w:val="000000"/>
+          <w:sz w:val="36"/>
+          <w:szCs w:val="36"/>
+          <w:shd w:val="clear" w:color="auto" w:fill="FFFFFF"/>
+        </w:rPr>
+        <w:t>underpredicted or overpredicted</w:t>
+      </w:r>
+      <w:r>
+        <w:rPr>
+          <w:rFonts w:cstheme="minorHAnsi"/>
+          <w:color w:val="000000"/>
+          <w:sz w:val="36"/>
+          <w:szCs w:val="36"/>
+          <w:shd w:val="clear" w:color="auto" w:fill="FFFFFF"/>
+        </w:rPr>
+        <w:t>. </w:t>
+      </w:r>
+      <w:r>
+        <w:rPr>
+          <w:rFonts w:cstheme="minorHAnsi"/>
+          <w:b/>
+          <w:bCs/>
+          <w:color w:val="000000"/>
+          <w:sz w:val="36"/>
+          <w:szCs w:val="36"/>
+          <w:shd w:val="clear" w:color="auto" w:fill="FFFFFF"/>
+        </w:rPr>
+        <w:t xml:space="preserve">Using </w:t>
+      </w:r>
+      <w:r>
+        <w:rPr>
+          <w:rFonts w:cstheme="minorHAnsi"/>
+          <w:b/>
+          <w:bCs/>
+          <w:color w:val="000000"/>
+          <w:sz w:val="36"/>
+          <w:szCs w:val="36"/>
+          <w:shd w:val="clear" w:color="auto" w:fill="FFFFFF"/>
+        </w:rPr>
+        <w:t>regularization</w:t>
+      </w:r>
+      <w:r>
+        <w:rPr>
+          <w:rFonts w:cstheme="minorHAnsi"/>
+          <w:b/>
+          <w:bCs/>
+          <w:color w:val="000000"/>
+          <w:sz w:val="36"/>
+          <w:szCs w:val="36"/>
+          <w:shd w:val="clear" w:color="auto" w:fill="FFFFFF"/>
+        </w:rPr>
+        <w:t xml:space="preserve"> with hyperparameters also did not help in improving the performance of model</w:t>
+      </w:r>
+      <w:r>
+        <w:rPr>
+          <w:rFonts w:cstheme="minorHAnsi"/>
+          <w:color w:val="000000"/>
+          <w:sz w:val="36"/>
+          <w:szCs w:val="36"/>
+          <w:shd w:val="clear" w:color="auto" w:fill="FFFFFF"/>
+        </w:rPr>
+        <w:t>. This indicate that the model might not be providing meaningful insights or relevance about the factors that influences the used car prices. Keys insights based on the </w:t>
+      </w:r>
+      <w:r>
+        <w:rPr>
+          <w:rFonts w:cstheme="minorHAnsi"/>
+          <w:b/>
+          <w:bCs/>
+          <w:i/>
+          <w:iCs/>
+          <w:color w:val="000000"/>
+          <w:sz w:val="36"/>
+          <w:szCs w:val="36"/>
+          <w:shd w:val="clear" w:color="auto" w:fill="FFFFFF"/>
+        </w:rPr>
+        <w:t>model coefficients</w:t>
+      </w:r>
+      <w:r>
+        <w:rPr>
+          <w:rFonts w:cstheme="minorHAnsi"/>
+          <w:color w:val="000000"/>
+          <w:sz w:val="36"/>
+          <w:szCs w:val="36"/>
+          <w:shd w:val="clear" w:color="auto" w:fill="FFFFFF"/>
+        </w:rPr>
+        <w:t> are,</w:t>
+      </w:r>
+    </w:p>
+    <w:p>
+      <w:pPr>
+        <w:numPr>
+          <w:ilvl w:val="0"/>
+          <w:numId w:val="4"/>
+        </w:numPr>
+        <w:rPr>
+          <w:rFonts w:cstheme="minorHAnsi"/>
+          <w:color w:val="000000"/>
+          <w:sz w:val="36"/>
+          <w:szCs w:val="36"/>
+          <w:shd w:val="clear" w:color="auto" w:fill="FFFFFF"/>
+        </w:rPr>
+      </w:pPr>
+      <w:proofErr w:type="spellStart"/>
+      <w:r>
+        <w:rPr>
+          <w:rFonts w:cstheme="minorHAnsi"/>
+          <w:b/>
+          <w:bCs/>
+          <w:i/>
+          <w:iCs/>
+          <w:color w:val="000000"/>
+          <w:sz w:val="36"/>
+          <w:szCs w:val="36"/>
+          <w:shd w:val="clear" w:color="auto" w:fill="FFFFFF"/>
+        </w:rPr>
+        <w:t>Car_age</w:t>
+      </w:r>
+      <w:proofErr w:type="spellEnd"/>
+      <w:r>
+        <w:rPr>
+          <w:rFonts w:cstheme="minorHAnsi"/>
+          <w:b/>
+          <w:bCs/>
+          <w:i/>
+          <w:iCs/>
+          <w:color w:val="000000"/>
+          <w:sz w:val="36"/>
+          <w:szCs w:val="36"/>
+          <w:shd w:val="clear" w:color="auto" w:fill="FFFFFF"/>
+        </w:rPr>
+        <w:t xml:space="preserve"> and odometer</w:t>
+      </w:r>
+      <w:r>
+        <w:rPr>
+          <w:rFonts w:cstheme="minorHAnsi"/>
+          <w:color w:val="000000"/>
+          <w:sz w:val="36"/>
+          <w:szCs w:val="36"/>
+          <w:shd w:val="clear" w:color="auto" w:fill="FFFFFF"/>
+        </w:rPr>
+        <w:t xml:space="preserve"> have the largest impact on used car price. Car with higher mileage have lesser price due to </w:t>
+      </w:r>
+      <w:r>
+        <w:rPr>
+          <w:rFonts w:cstheme="minorHAnsi"/>
+          <w:color w:val="000000"/>
+          <w:sz w:val="36"/>
+          <w:szCs w:val="36"/>
+          <w:shd w:val="clear" w:color="auto" w:fill="FFFFFF"/>
+        </w:rPr>
+        <w:lastRenderedPageBreak/>
+        <w:t>wear and tear. Similarly older cars have less value compared to new ones.</w:t>
+      </w:r>
+    </w:p>
+    <w:p>
+      <w:pPr>
+        <w:numPr>
+          <w:ilvl w:val="0"/>
+          <w:numId w:val="4"/>
+        </w:numPr>
+        <w:rPr>
+          <w:rFonts w:cstheme="minorHAnsi"/>
+          <w:color w:val="000000"/>
+          <w:sz w:val="36"/>
+          <w:szCs w:val="36"/>
+          <w:shd w:val="clear" w:color="auto" w:fill="FFFFFF"/>
+        </w:rPr>
+      </w:pPr>
+      <w:r>
+        <w:rPr>
+          <w:rFonts w:cstheme="minorHAnsi"/>
+          <w:color w:val="000000"/>
+          <w:sz w:val="36"/>
+          <w:szCs w:val="36"/>
+          <w:shd w:val="clear" w:color="auto" w:fill="FFFFFF"/>
+        </w:rPr>
+        <w:t>Categorical feature like car </w:t>
+      </w:r>
+      <w:r>
+        <w:rPr>
+          <w:rFonts w:cstheme="minorHAnsi"/>
+          <w:b/>
+          <w:bCs/>
+          <w:i/>
+          <w:iCs/>
+          <w:color w:val="000000"/>
+          <w:sz w:val="36"/>
+          <w:szCs w:val="36"/>
+          <w:shd w:val="clear" w:color="auto" w:fill="FFFFFF"/>
+        </w:rPr>
+        <w:t>condition</w:t>
+      </w:r>
+      <w:r>
+        <w:rPr>
+          <w:rFonts w:cstheme="minorHAnsi"/>
+          <w:color w:val="000000"/>
+          <w:sz w:val="36"/>
+          <w:szCs w:val="36"/>
+          <w:shd w:val="clear" w:color="auto" w:fill="FFFFFF"/>
+        </w:rPr>
+        <w:t> </w:t>
+      </w:r>
+      <w:r>
+        <w:rPr>
+          <w:rFonts w:cstheme="minorHAnsi"/>
+          <w:color w:val="000000"/>
+          <w:sz w:val="36"/>
+          <w:szCs w:val="36"/>
+          <w:shd w:val="clear" w:color="auto" w:fill="FFFFFF"/>
+        </w:rPr>
+        <w:t>suggests</w:t>
+      </w:r>
+      <w:r>
+        <w:rPr>
+          <w:rFonts w:cstheme="minorHAnsi"/>
+          <w:color w:val="000000"/>
+          <w:sz w:val="36"/>
+          <w:szCs w:val="36"/>
+          <w:shd w:val="clear" w:color="auto" w:fill="FFFFFF"/>
+        </w:rPr>
+        <w:t xml:space="preserve"> that car with good conditions </w:t>
+      </w:r>
+      <w:r>
+        <w:rPr>
+          <w:rFonts w:cstheme="minorHAnsi"/>
+          <w:color w:val="000000"/>
+          <w:sz w:val="36"/>
+          <w:szCs w:val="36"/>
+          <w:shd w:val="clear" w:color="auto" w:fill="FFFFFF"/>
+        </w:rPr>
+        <w:t>is</w:t>
+      </w:r>
+      <w:r>
+        <w:rPr>
+          <w:rFonts w:cstheme="minorHAnsi"/>
+          <w:color w:val="000000"/>
+          <w:sz w:val="36"/>
+          <w:szCs w:val="36"/>
+          <w:shd w:val="clear" w:color="auto" w:fill="FFFFFF"/>
+        </w:rPr>
+        <w:t xml:space="preserve"> priced higher as compared with condition like new.</w:t>
+      </w:r>
+    </w:p>
+    <w:p>
+      <w:pPr>
+        <w:numPr>
+          <w:ilvl w:val="0"/>
+          <w:numId w:val="4"/>
+        </w:numPr>
+        <w:rPr>
+          <w:rFonts w:cstheme="minorHAnsi"/>
+          <w:color w:val="000000"/>
+          <w:sz w:val="36"/>
+          <w:szCs w:val="36"/>
+          <w:shd w:val="clear" w:color="auto" w:fill="FFFFFF"/>
+        </w:rPr>
+      </w:pPr>
+      <w:r>
+        <w:rPr>
+          <w:rFonts w:cstheme="minorHAnsi"/>
+          <w:color w:val="000000"/>
+          <w:sz w:val="36"/>
+          <w:szCs w:val="36"/>
+          <w:shd w:val="clear" w:color="auto" w:fill="FFFFFF"/>
+        </w:rPr>
+        <w:t>Car with </w:t>
+      </w:r>
+      <w:r>
+        <w:rPr>
+          <w:rFonts w:cstheme="minorHAnsi"/>
+          <w:b/>
+          <w:bCs/>
+          <w:i/>
+          <w:iCs/>
+          <w:color w:val="000000"/>
+          <w:sz w:val="36"/>
+          <w:szCs w:val="36"/>
+          <w:shd w:val="clear" w:color="auto" w:fill="FFFFFF"/>
+        </w:rPr>
+        <w:t>4-wheel</w:t>
+      </w:r>
+      <w:r>
+        <w:rPr>
+          <w:rFonts w:cstheme="minorHAnsi"/>
+          <w:b/>
+          <w:bCs/>
+          <w:i/>
+          <w:iCs/>
+          <w:color w:val="000000"/>
+          <w:sz w:val="36"/>
+          <w:szCs w:val="36"/>
+          <w:shd w:val="clear" w:color="auto" w:fill="FFFFFF"/>
+        </w:rPr>
+        <w:t xml:space="preserve"> drive</w:t>
+      </w:r>
+      <w:r>
+        <w:rPr>
+          <w:rFonts w:cstheme="minorHAnsi"/>
+          <w:color w:val="000000"/>
+          <w:sz w:val="36"/>
+          <w:szCs w:val="36"/>
+          <w:shd w:val="clear" w:color="auto" w:fill="FFFFFF"/>
+        </w:rPr>
+        <w:t> </w:t>
+      </w:r>
+      <w:r>
+        <w:rPr>
+          <w:rFonts w:cstheme="minorHAnsi"/>
+          <w:color w:val="000000"/>
+          <w:sz w:val="36"/>
+          <w:szCs w:val="36"/>
+          <w:shd w:val="clear" w:color="auto" w:fill="FFFFFF"/>
+        </w:rPr>
+        <w:t>is</w:t>
+      </w:r>
+      <w:r>
+        <w:rPr>
+          <w:rFonts w:cstheme="minorHAnsi"/>
+          <w:color w:val="000000"/>
+          <w:sz w:val="36"/>
+          <w:szCs w:val="36"/>
+          <w:shd w:val="clear" w:color="auto" w:fill="FFFFFF"/>
+        </w:rPr>
+        <w:t xml:space="preserve"> priced higher </w:t>
+      </w:r>
+      <w:r>
+        <w:rPr>
+          <w:rFonts w:cstheme="minorHAnsi"/>
+          <w:color w:val="000000"/>
+          <w:sz w:val="36"/>
+          <w:szCs w:val="36"/>
+          <w:shd w:val="clear" w:color="auto" w:fill="FFFFFF"/>
+        </w:rPr>
+        <w:t>than</w:t>
+      </w:r>
+      <w:r>
+        <w:rPr>
+          <w:rFonts w:cstheme="minorHAnsi"/>
+          <w:color w:val="000000"/>
+          <w:sz w:val="36"/>
+          <w:szCs w:val="36"/>
+          <w:shd w:val="clear" w:color="auto" w:fill="FFFFFF"/>
+        </w:rPr>
+        <w:t xml:space="preserve"> car with front </w:t>
+      </w:r>
+      <w:r>
+        <w:rPr>
+          <w:rFonts w:cstheme="minorHAnsi"/>
+          <w:color w:val="000000"/>
+          <w:sz w:val="36"/>
+          <w:szCs w:val="36"/>
+          <w:shd w:val="clear" w:color="auto" w:fill="FFFFFF"/>
+        </w:rPr>
+        <w:t>wheel (</w:t>
+      </w:r>
+      <w:r>
+        <w:rPr>
+          <w:rFonts w:cstheme="minorHAnsi"/>
+          <w:color w:val="000000"/>
+          <w:sz w:val="36"/>
+          <w:szCs w:val="36"/>
+          <w:shd w:val="clear" w:color="auto" w:fill="FFFFFF"/>
+        </w:rPr>
+        <w:t xml:space="preserve">FWD) and rear wheel </w:t>
+      </w:r>
+      <w:r>
+        <w:rPr>
+          <w:rFonts w:cstheme="minorHAnsi"/>
+          <w:color w:val="000000"/>
+          <w:sz w:val="36"/>
+          <w:szCs w:val="36"/>
+          <w:shd w:val="clear" w:color="auto" w:fill="FFFFFF"/>
+        </w:rPr>
+        <w:t>drive (</w:t>
+      </w:r>
+      <w:r>
+        <w:rPr>
+          <w:rFonts w:cstheme="minorHAnsi"/>
+          <w:color w:val="000000"/>
+          <w:sz w:val="36"/>
+          <w:szCs w:val="36"/>
+          <w:shd w:val="clear" w:color="auto" w:fill="FFFFFF"/>
+        </w:rPr>
+        <w:t>RWD).</w:t>
+      </w:r>
+    </w:p>
+    <w:p>
+      <w:pPr>
+        <w:numPr>
+          <w:ilvl w:val="0"/>
+          <w:numId w:val="4"/>
+        </w:numPr>
+        <w:rPr>
+          <w:rFonts w:cstheme="minorHAnsi"/>
+          <w:color w:val="000000"/>
+          <w:sz w:val="36"/>
+          <w:szCs w:val="36"/>
+          <w:shd w:val="clear" w:color="auto" w:fill="FFFFFF"/>
+        </w:rPr>
+      </w:pPr>
+    </w:p>
+    <w:p>
+      <w:pPr>
+        <w:rPr>
+          <w:rFonts w:cstheme="minorHAnsi"/>
+          <w:color w:val="000000"/>
+          <w:sz w:val="36"/>
+          <w:szCs w:val="36"/>
+          <w:shd w:val="clear" w:color="auto" w:fill="FFFFFF"/>
+        </w:rPr>
+      </w:pPr>
+      <w:r>
+        <w:rPr>
+          <w:rFonts w:cstheme="minorHAnsi"/>
+          <w:color w:val="000000"/>
+          <w:sz w:val="36"/>
+          <w:szCs w:val="36"/>
+          <w:shd w:val="clear" w:color="auto" w:fill="FFFFFF"/>
+        </w:rPr>
+        <w:t>Even though linear regression provides some insights on the car price, the predictive accuracy is not high enough to provide reliable pricing for unseen cars that gets added to inventory. Overall conclusion is all the 3 models do not give us required confidence that the factor chosen are deriving and predicting car prices. </w:t>
+      </w:r>
+      <w:r>
+        <w:rPr>
+          <w:rFonts w:cstheme="minorHAnsi"/>
+          <w:b/>
+          <w:bCs/>
+          <w:color w:val="000000"/>
+          <w:sz w:val="36"/>
+          <w:szCs w:val="36"/>
+          <w:shd w:val="clear" w:color="auto" w:fill="FFFFFF"/>
+        </w:rPr>
+        <w:t xml:space="preserve">The results </w:t>
+      </w:r>
+      <w:r>
+        <w:rPr>
+          <w:rFonts w:cstheme="minorHAnsi"/>
+          <w:b/>
+          <w:bCs/>
+          <w:color w:val="000000"/>
+          <w:sz w:val="36"/>
+          <w:szCs w:val="36"/>
+          <w:shd w:val="clear" w:color="auto" w:fill="FFFFFF"/>
+        </w:rPr>
+        <w:t>seem</w:t>
+      </w:r>
+      <w:r>
+        <w:rPr>
+          <w:rFonts w:cstheme="minorHAnsi"/>
+          <w:b/>
+          <w:bCs/>
+          <w:color w:val="000000"/>
+          <w:sz w:val="36"/>
+          <w:szCs w:val="36"/>
+          <w:shd w:val="clear" w:color="auto" w:fill="FFFFFF"/>
+        </w:rPr>
+        <w:t xml:space="preserve"> to be inconclusive.</w:t>
+      </w:r>
+    </w:p>
+    <w:p>
+      <w:pPr>
+        <w:rPr>
+          <w:rFonts w:cstheme="minorHAnsi"/>
+          <w:color w:val="000000"/>
+          <w:sz w:val="36"/>
+          <w:szCs w:val="36"/>
+          <w:shd w:val="clear" w:color="auto" w:fill="FFFFFF"/>
+        </w:rPr>
+      </w:pPr>
+      <w:r>
+        <w:rPr>
+          <w:rFonts w:cstheme="minorHAnsi"/>
+          <w:b/>
+          <w:bCs/>
+          <w:i/>
+          <w:iCs/>
+          <w:color w:val="000000"/>
+          <w:sz w:val="36"/>
+          <w:szCs w:val="36"/>
+          <w:shd w:val="clear" w:color="auto" w:fill="FFFFFF"/>
+        </w:rPr>
+        <w:t>Recommendation</w:t>
+      </w:r>
+      <w:r>
+        <w:rPr>
+          <w:rFonts w:cstheme="minorHAnsi"/>
+          <w:color w:val="000000"/>
+          <w:sz w:val="36"/>
+          <w:szCs w:val="36"/>
+          <w:shd w:val="clear" w:color="auto" w:fill="FFFFFF"/>
+        </w:rPr>
+        <w:t xml:space="preserve"> To be more conclusive on the drivers for the car price, we might want to used different models that could explain more variance. We need to </w:t>
+      </w:r>
+      <w:r>
+        <w:rPr>
+          <w:rFonts w:cstheme="minorHAnsi"/>
+          <w:color w:val="000000"/>
+          <w:sz w:val="36"/>
+          <w:szCs w:val="36"/>
+          <w:shd w:val="clear" w:color="auto" w:fill="FFFFFF"/>
+        </w:rPr>
+        <w:t>revisit</w:t>
+      </w:r>
+      <w:r>
+        <w:rPr>
+          <w:rFonts w:cstheme="minorHAnsi"/>
+          <w:color w:val="000000"/>
+          <w:sz w:val="36"/>
+          <w:szCs w:val="36"/>
+          <w:shd w:val="clear" w:color="auto" w:fill="FFFFFF"/>
+        </w:rPr>
+        <w:t xml:space="preserve"> or add certain features in the models along with their correlation to draw better insights. Maybe adding </w:t>
+      </w:r>
+      <w:r>
+        <w:rPr>
+          <w:rFonts w:cstheme="minorHAnsi"/>
+          <w:color w:val="000000"/>
+          <w:sz w:val="36"/>
+          <w:szCs w:val="36"/>
+          <w:shd w:val="clear" w:color="auto" w:fill="FFFFFF"/>
+        </w:rPr>
+        <w:t>other</w:t>
+      </w:r>
+      <w:r>
+        <w:rPr>
+          <w:rFonts w:cstheme="minorHAnsi"/>
+          <w:color w:val="000000"/>
+          <w:sz w:val="36"/>
+          <w:szCs w:val="36"/>
+          <w:shd w:val="clear" w:color="auto" w:fill="FFFFFF"/>
+        </w:rPr>
+        <w:t xml:space="preserve"> features or computing certain feature maybe </w:t>
+      </w:r>
+      <w:r>
+        <w:rPr>
+          <w:rFonts w:cstheme="minorHAnsi"/>
+          <w:color w:val="000000"/>
+          <w:sz w:val="36"/>
+          <w:szCs w:val="36"/>
+          <w:shd w:val="clear" w:color="auto" w:fill="FFFFFF"/>
+        </w:rPr>
+        <w:t>led</w:t>
+      </w:r>
+      <w:r>
+        <w:rPr>
+          <w:rFonts w:cstheme="minorHAnsi"/>
+          <w:color w:val="000000"/>
+          <w:sz w:val="36"/>
+          <w:szCs w:val="36"/>
+          <w:shd w:val="clear" w:color="auto" w:fill="FFFFFF"/>
+        </w:rPr>
+        <w:t xml:space="preserve"> us to better model accuracy. Considering the R2 score, maybe using more complex models to capture more of the variance in price variable will be effective. Further hyperparameter tuning might help us overcome underfitting and overfitting of model.</w:t>
+      </w:r>
+    </w:p>
+    <w:p>
+      <w:pPr>
+        <w:rPr>
+          <w:rFonts w:cstheme="minorHAnsi"/>
           <w:color w:val="000000"/>
           <w:sz w:val="36"/>
           <w:szCs w:val="36"/>
@@ -89,6 +1299,28 @@
           <w:shd w:val="clear" w:color="auto" w:fill="FFFFFF"/>
         </w:rPr>
         <w:t xml:space="preserve">Notebook Link: </w:t>
+      </w:r>
+      <w:hyperlink r:id="rId5" w:history="1">
+        <w:r>
+          <w:rPr>
+            <w:rStyle w:val="Hyperlink"/>
+            <w:rFonts w:cstheme="minorHAnsi"/>
+            <w:sz w:val="36"/>
+            <w:szCs w:val="36"/>
+            <w:shd w:val="clear" w:color="auto" w:fill="FFFFFF"/>
+          </w:rPr>
+          <w:t>https://github.com/suchitashirke/AIMLProject/blob/main/used_car_price_predictor/used_car_price_predictor.ipynb</w:t>
+        </w:r>
+      </w:hyperlink>
+      <w:r>
+        <w:rPr>
+          <w:rFonts w:cstheme="minorHAnsi"/>
+          <w:color w:val="000000"/>
+          <w:sz w:val="36"/>
+          <w:szCs w:val="36"/>
+          <w:shd w:val="clear" w:color="auto" w:fill="FFFFFF"/>
+        </w:rPr>
+        <w:t xml:space="preserve"> </w:t>
       </w:r>
     </w:p>
     <w:sectPr>
@@ -282,6 +1514,155 @@
     </w:lvl>
   </w:abstractNum>
   <w:abstractNum w:abstractNumId="2" w15:restartNumberingAfterBreak="0">
+    <w:nsid w:val="72B9612C"/>
+    <w:multiLevelType w:val="multilevel"/>
+    <w:tmpl w:val="262CBFBC"/>
+    <w:lvl w:ilvl="0">
+      <w:start w:val="1"/>
+      <w:numFmt w:val="bullet"/>
+      <w:lvlText w:val=""/>
+      <w:lvlJc w:val="left"/>
+      <w:pPr>
+        <w:tabs>
+          <w:tab w:val="num" w:pos="720"/>
+        </w:tabs>
+        <w:ind w:left="720" w:hanging="360"/>
+      </w:pPr>
+      <w:rPr>
+        <w:rFonts w:ascii="Symbol" w:hAnsi="Symbol" w:hint="default"/>
+        <w:sz w:val="20"/>
+      </w:rPr>
+    </w:lvl>
+    <w:lvl w:ilvl="1" w:tentative="1">
+      <w:start w:val="1"/>
+      <w:numFmt w:val="bullet"/>
+      <w:lvlText w:val=""/>
+      <w:lvlJc w:val="left"/>
+      <w:pPr>
+        <w:tabs>
+          <w:tab w:val="num" w:pos="1440"/>
+        </w:tabs>
+        <w:ind w:left="1440" w:hanging="360"/>
+      </w:pPr>
+      <w:rPr>
+        <w:rFonts w:ascii="Symbol" w:hAnsi="Symbol" w:hint="default"/>
+        <w:sz w:val="20"/>
+      </w:rPr>
+    </w:lvl>
+    <w:lvl w:ilvl="2" w:tentative="1">
+      <w:start w:val="1"/>
+      <w:numFmt w:val="bullet"/>
+      <w:lvlText w:val=""/>
+      <w:lvlJc w:val="left"/>
+      <w:pPr>
+        <w:tabs>
+          <w:tab w:val="num" w:pos="2160"/>
+        </w:tabs>
+        <w:ind w:left="2160" w:hanging="360"/>
+      </w:pPr>
+      <w:rPr>
+        <w:rFonts w:ascii="Symbol" w:hAnsi="Symbol" w:hint="default"/>
+        <w:sz w:val="20"/>
+      </w:rPr>
+    </w:lvl>
+    <w:lvl w:ilvl="3" w:tentative="1">
+      <w:start w:val="1"/>
+      <w:numFmt w:val="bullet"/>
+      <w:lvlText w:val=""/>
+      <w:lvlJc w:val="left"/>
+      <w:pPr>
+        <w:tabs>
+          <w:tab w:val="num" w:pos="2880"/>
+        </w:tabs>
+        <w:ind w:left="2880" w:hanging="360"/>
+      </w:pPr>
+      <w:rPr>
+        <w:rFonts w:ascii="Symbol" w:hAnsi="Symbol" w:hint="default"/>
+        <w:sz w:val="20"/>
+      </w:rPr>
+    </w:lvl>
+    <w:lvl w:ilvl="4" w:tentative="1">
+      <w:start w:val="1"/>
+      <w:numFmt w:val="bullet"/>
+      <w:lvlText w:val=""/>
+      <w:lvlJc w:val="left"/>
+      <w:pPr>
+        <w:tabs>
+          <w:tab w:val="num" w:pos="3600"/>
+        </w:tabs>
+        <w:ind w:left="3600" w:hanging="360"/>
+      </w:pPr>
+      <w:rPr>
+        <w:rFonts w:ascii="Symbol" w:hAnsi="Symbol" w:hint="default"/>
+        <w:sz w:val="20"/>
+      </w:rPr>
+    </w:lvl>
+    <w:lvl w:ilvl="5" w:tentative="1">
+      <w:start w:val="1"/>
+      <w:numFmt w:val="bullet"/>
+      <w:lvlText w:val=""/>
+      <w:lvlJc w:val="left"/>
+      <w:pPr>
+        <w:tabs>
+          <w:tab w:val="num" w:pos="4320"/>
+        </w:tabs>
+        <w:ind w:left="4320" w:hanging="360"/>
+      </w:pPr>
+      <w:rPr>
+        <w:rFonts w:ascii="Symbol" w:hAnsi="Symbol" w:hint="default"/>
+        <w:sz w:val="20"/>
+      </w:rPr>
+    </w:lvl>
+    <w:lvl w:ilvl="6" w:tentative="1">
+      <w:start w:val="1"/>
+      <w:numFmt w:val="bullet"/>
+      <w:lvlText w:val=""/>
+      <w:lvlJc w:val="left"/>
+      <w:pPr>
+        <w:tabs>
+          <w:tab w:val="num" w:pos="5040"/>
+        </w:tabs>
+        <w:ind w:left="5040" w:hanging="360"/>
+      </w:pPr>
+      <w:rPr>
+        <w:rFonts w:ascii="Symbol" w:hAnsi="Symbol" w:hint="default"/>
+        <w:sz w:val="20"/>
+      </w:rPr>
+    </w:lvl>
+    <w:lvl w:ilvl="7" w:tentative="1">
+      <w:start w:val="1"/>
+      <w:numFmt w:val="bullet"/>
+      <w:lvlText w:val=""/>
+      <w:lvlJc w:val="left"/>
+      <w:pPr>
+        <w:tabs>
+          <w:tab w:val="num" w:pos="5760"/>
+        </w:tabs>
+        <w:ind w:left="5760" w:hanging="360"/>
+      </w:pPr>
+      <w:rPr>
+        <w:rFonts w:ascii="Symbol" w:hAnsi="Symbol" w:hint="default"/>
+        <w:sz w:val="20"/>
+      </w:rPr>
+    </w:lvl>
+    <w:lvl w:ilvl="8" w:tentative="1">
+      <w:start w:val="1"/>
+      <w:numFmt w:val="bullet"/>
+      <w:lvlText w:val=""/>
+      <w:lvlJc w:val="left"/>
+      <w:pPr>
+        <w:tabs>
+          <w:tab w:val="num" w:pos="6480"/>
+        </w:tabs>
+        <w:ind w:left="6480" w:hanging="360"/>
+      </w:pPr>
+      <w:rPr>
+        <w:rFonts w:ascii="Symbol" w:hAnsi="Symbol" w:hint="default"/>
+        <w:sz w:val="20"/>
+      </w:rPr>
+    </w:lvl>
+  </w:abstractNum>
+  <w:abstractNum w:abstractNumId="3" w15:restartNumberingAfterBreak="0">
     <w:nsid w:val="768C2442"/>
     <w:multiLevelType w:val="multilevel"/>
     <w:tmpl w:val="65A61714"/>
@@ -401,6 +1782,9 @@
     <w:abstractNumId w:val="1"/>
   </w:num>
   <w:num w:numId="3" w16cid:durableId="1351760024">
+    <w:abstractNumId w:val="3"/>
+  </w:num>
+  <w:num w:numId="4" w16cid:durableId="122964705">
     <w:abstractNumId w:val="2"/>
   </w:num>
 </w:numbering>
@@ -803,6 +2187,29 @@
     <w:name w:val="Normal"/>
     <w:qFormat/>
   </w:style>
+  <w:style w:type="paragraph" w:styleId="Heading2">
+    <w:name w:val="heading 2"/>
+    <w:basedOn w:val="Normal"/>
+    <w:next w:val="Normal"/>
+    <w:link w:val="Heading2Char"/>
+    <w:uiPriority w:val="9"/>
+    <w:semiHidden/>
+    <w:unhideWhenUsed/>
+    <w:qFormat/>
+    <w:rsid w:val="00BC1921"/>
+    <w:pPr>
+      <w:keepNext/>
+      <w:keepLines/>
+      <w:spacing w:before="40"/>
+      <w:outlineLvl w:val="1"/>
+    </w:pPr>
+    <w:rPr>
+      <w:rFonts w:asciiTheme="majorHAnsi" w:eastAsiaTheme="majorEastAsia" w:hAnsiTheme="majorHAnsi" w:cstheme="majorBidi"/>
+      <w:color w:val="2F5496" w:themeColor="accent1" w:themeShade="BF"/>
+      <w:sz w:val="26"/>
+      <w:szCs w:val="26"/>
+    </w:rPr>
+  </w:style>
   <w:style w:type="paragraph" w:styleId="Heading3">
     <w:name w:val="heading 3"/>
     <w:basedOn w:val="Normal"/>
@@ -827,7 +2234,6 @@
   <w:style w:type="character" w:default="1" w:styleId="DefaultParagraphFont">
     <w:name w:val="Default Paragraph Font"/>
     <w:uiPriority w:val="1"/>
-    <w:semiHidden/>
     <w:unhideWhenUsed/>
   </w:style>
   <w:style w:type="table" w:default="1" w:styleId="TableNormal">
@@ -903,6 +2309,43 @@
     <w:rPr>
       <w:b/>
       <w:bCs/>
+    </w:rPr>
+  </w:style>
+  <w:style w:type="character" w:customStyle="1" w:styleId="Heading2Char">
+    <w:name w:val="Heading 2 Char"/>
+    <w:basedOn w:val="DefaultParagraphFont"/>
+    <w:link w:val="Heading2"/>
+    <w:uiPriority w:val="9"/>
+    <w:semiHidden/>
+    <w:rsid w:val="00BC1921"/>
+    <w:rPr>
+      <w:rFonts w:asciiTheme="majorHAnsi" w:eastAsiaTheme="majorEastAsia" w:hAnsiTheme="majorHAnsi" w:cstheme="majorBidi"/>
+      <w:color w:val="2F5496" w:themeColor="accent1" w:themeShade="BF"/>
+      <w:sz w:val="26"/>
+      <w:szCs w:val="26"/>
+    </w:rPr>
+  </w:style>
+  <w:style w:type="character" w:styleId="Hyperlink">
+    <w:name w:val="Hyperlink"/>
+    <w:basedOn w:val="DefaultParagraphFont"/>
+    <w:uiPriority w:val="99"/>
+    <w:unhideWhenUsed/>
+    <w:rsid w:val="00491C43"/>
+    <w:rPr>
+      <w:color w:val="0563C1" w:themeColor="hyperlink"/>
+      <w:u w:val="single"/>
+    </w:rPr>
+  </w:style>
+  <w:style w:type="character" w:styleId="UnresolvedMention">
+    <w:name w:val="Unresolved Mention"/>
+    <w:basedOn w:val="DefaultParagraphFont"/>
+    <w:uiPriority w:val="99"/>
+    <w:semiHidden/>
+    <w:unhideWhenUsed/>
+    <w:rsid w:val="00491C43"/>
+    <w:rPr>
+      <w:color w:val="605E5C"/>
+      <w:shd w:val="clear" w:color="auto" w:fill="E1DFDD"/>
     </w:rPr>
   </w:style>
 </w:styles>

</xml_diff>